<commit_message>
docs: add file attachment admin guide and update allowed formats
- Update `docs/user-guide/14-failide-lisamine.md` with accurate allowed
  S3 upload formats (.pdf, .jpg/.jpeg, .png, .tiff), size limits
  (10 MB UI, 20 MB S3 proxy, 200 chars filename), and S3/history notes.
- Add `docs/admin-guide/08-manused.md` covering file upload UI flow,
  S3 key structure, DB schema, soft-delete, audit logging, and
  historical version viewing via DB and S3 versioning.
- Regenerate combined Markdown and Word documents.
- Update TODO list.
</commit_message>
<xml_diff>
--- a/docs/admin-guide.docx
+++ b/docs/admin-guide.docx
@@ -2,7 +2,7 @@
 <file path=word/document.xml><?xml version="1.0" encoding="utf-8"?>
 <w:document xmlns:w="http://schemas.openxmlformats.org/wordprocessingml/2006/main" xmlns:m="http://schemas.openxmlformats.org/officeDocument/2006/math" xmlns:r="http://schemas.openxmlformats.org/officeDocument/2006/relationships" xmlns:o="urn:schemas-microsoft-com:office:office" xmlns:v="urn:schemas-microsoft-com:vml" xmlns:w10="urn:schemas-microsoft-com:office:word" xmlns:a="http://schemas.openxmlformats.org/drawingml/2006/main" xmlns:pic="http://schemas.openxmlformats.org/drawingml/2006/picture" xmlns:wp="http://schemas.openxmlformats.org/drawingml/2006/wordprocessingDrawing">
   <w:body>
-    <w:bookmarkStart w:id="80" w:name="ljvis2-administraatorijuhend"/>
+    <w:bookmarkStart w:id="96" w:name="ljvis2-administraatorijuhend"/>
     <w:p>
       <w:pPr>
         <w:pStyle w:val="Heading1"/>
@@ -13914,7 +13914,1891 @@
     </w:p>
     <w:bookmarkEnd w:id="78"/>
     <w:bookmarkEnd w:id="79"/>
+    <w:bookmarkStart w:id="80" w:name="manuste-haldus-ja-s3-hoiustamine"/>
+    <w:p>
+      <w:pPr>
+        <w:pStyle w:val="Heading2"/>
+      </w:pPr>
+      <w:r>
+        <w:t xml:space="preserve">Manuste haldus ja S3 hoiustamine</w:t>
+      </w:r>
+    </w:p>
+    <w:p>
+      <w:pPr>
+        <w:pStyle w:val="FirstParagraph"/>
+      </w:pPr>
+      <w:r>
+        <w:t xml:space="preserve">Selles jaos kirjeldatakse, kuidas vormidega seotud failid tehniliselt töölevad, millised on piirangud ning kuidas neid ajalooliselt jälgida.</w:t>
+      </w:r>
+    </w:p>
     <w:bookmarkEnd w:id="80"/>
+    <w:bookmarkStart w:id="81" w:name="lubatud-failiformaadid-ja-suurused"/>
+    <w:p>
+      <w:pPr>
+        <w:pStyle w:val="Heading2"/>
+      </w:pPr>
+      <w:r>
+        <w:t xml:space="preserve">Lubatud failiformaadid ja suurused</w:t>
+      </w:r>
+    </w:p>
+    <w:p>
+      <w:pPr>
+        <w:pStyle w:val="FirstParagraph"/>
+      </w:pPr>
+      <w:r>
+        <w:t xml:space="preserve">Kasutajaliidese failivalik (</w:t>
+      </w:r>
+      <w:r>
+        <w:rPr>
+          <w:rStyle w:val="VerbatimChar"/>
+        </w:rPr>
+        <w:t xml:space="preserve">FileUploadBlock</w:t>
+      </w:r>
+      <w:r>
+        <w:t xml:space="preserve">) aktsepteerib vaikimisi järgmisi laiendeid:</w:t>
+      </w:r>
+    </w:p>
+    <w:p>
+      <w:pPr>
+        <w:pStyle w:val="SourceCode"/>
+      </w:pPr>
+      <w:r>
+        <w:rPr>
+          <w:rStyle w:val="VerbatimChar"/>
+        </w:rPr>
+        <w:t xml:space="preserve">const ALLOWED_ACCEPT = '.pdf,.jpg,.jpeg,.png,.tiff';</w:t>
+      </w:r>
+      <w:r>
+        <w:br/>
+      </w:r>
+      <w:r>
+        <w:rPr>
+          <w:rStyle w:val="VerbatimChar"/>
+        </w:rPr>
+        <w:t xml:space="preserve">const MAX_SIZE_MB = 10;</w:t>
+      </w:r>
+    </w:p>
+    <w:tbl>
+      <w:tblPr>
+        <w:tblStyle w:val="Table"/>
+        <w:tblW w:type="auto" w:w="0"/>
+        <w:tblLook w:firstRow="1" w:lastRow="0" w:firstColumn="0" w:lastColumn="0" w:noHBand="0" w:noVBand="0" w:val="0020"/>
+      </w:tblPr>
+      <w:tblGrid>
+        <w:gridCol w:w="3960"/>
+        <w:gridCol w:w="3960"/>
+      </w:tblGrid>
+      <w:tr>
+        <w:trPr>
+          <w:tblHeader w:val="on"/>
+        </w:trPr>
+        <w:tc>
+          <w:tcPr/>
+          <w:p>
+            <w:pPr>
+              <w:pStyle w:val="Compact"/>
+            </w:pPr>
+            <w:r>
+              <w:t xml:space="preserve">Laiend</w:t>
+            </w:r>
+          </w:p>
+        </w:tc>
+        <w:tc>
+          <w:tcPr/>
+          <w:p>
+            <w:pPr>
+              <w:pStyle w:val="Compact"/>
+            </w:pPr>
+            <w:r>
+              <w:t xml:space="preserve">MIME-tüüp</w:t>
+            </w:r>
+          </w:p>
+        </w:tc>
+      </w:tr>
+      <w:tr>
+        <w:tc>
+          <w:tcPr/>
+          <w:p>
+            <w:pPr>
+              <w:pStyle w:val="Compact"/>
+            </w:pPr>
+            <w:r>
+              <w:rPr>
+                <w:rStyle w:val="VerbatimChar"/>
+              </w:rPr>
+              <w:t xml:space="preserve">.pdf</w:t>
+            </w:r>
+          </w:p>
+        </w:tc>
+        <w:tc>
+          <w:tcPr/>
+          <w:p>
+            <w:pPr>
+              <w:pStyle w:val="Compact"/>
+            </w:pPr>
+            <w:r>
+              <w:rPr>
+                <w:rStyle w:val="VerbatimChar"/>
+              </w:rPr>
+              <w:t xml:space="preserve">application/pdf</w:t>
+            </w:r>
+          </w:p>
+        </w:tc>
+      </w:tr>
+      <w:tr>
+        <w:tc>
+          <w:tcPr/>
+          <w:p>
+            <w:pPr>
+              <w:pStyle w:val="Compact"/>
+            </w:pPr>
+            <w:r>
+              <w:rPr>
+                <w:rStyle w:val="VerbatimChar"/>
+              </w:rPr>
+              <w:t xml:space="preserve">.jpg</w:t>
+            </w:r>
+            <w:r>
+              <w:t xml:space="preserve">,</w:t>
+            </w:r>
+            <w:r>
+              <w:t xml:space="preserve"> </w:t>
+            </w:r>
+            <w:r>
+              <w:rPr>
+                <w:rStyle w:val="VerbatimChar"/>
+              </w:rPr>
+              <w:t xml:space="preserve">.jpeg</w:t>
+            </w:r>
+          </w:p>
+        </w:tc>
+        <w:tc>
+          <w:tcPr/>
+          <w:p>
+            <w:pPr>
+              <w:pStyle w:val="Compact"/>
+            </w:pPr>
+            <w:r>
+              <w:rPr>
+                <w:rStyle w:val="VerbatimChar"/>
+              </w:rPr>
+              <w:t xml:space="preserve">image/jpeg</w:t>
+            </w:r>
+          </w:p>
+        </w:tc>
+      </w:tr>
+      <w:tr>
+        <w:tc>
+          <w:tcPr/>
+          <w:p>
+            <w:pPr>
+              <w:pStyle w:val="Compact"/>
+            </w:pPr>
+            <w:r>
+              <w:rPr>
+                <w:rStyle w:val="VerbatimChar"/>
+              </w:rPr>
+              <w:t xml:space="preserve">.png</w:t>
+            </w:r>
+          </w:p>
+        </w:tc>
+        <w:tc>
+          <w:tcPr/>
+          <w:p>
+            <w:pPr>
+              <w:pStyle w:val="Compact"/>
+            </w:pPr>
+            <w:r>
+              <w:rPr>
+                <w:rStyle w:val="VerbatimChar"/>
+              </w:rPr>
+              <w:t xml:space="preserve">image/png</w:t>
+            </w:r>
+          </w:p>
+        </w:tc>
+      </w:tr>
+      <w:tr>
+        <w:tc>
+          <w:tcPr/>
+          <w:p>
+            <w:pPr>
+              <w:pStyle w:val="Compact"/>
+            </w:pPr>
+            <w:r>
+              <w:rPr>
+                <w:rStyle w:val="VerbatimChar"/>
+              </w:rPr>
+              <w:t xml:space="preserve">.tiff</w:t>
+            </w:r>
+          </w:p>
+        </w:tc>
+        <w:tc>
+          <w:tcPr/>
+          <w:p>
+            <w:pPr>
+              <w:pStyle w:val="Compact"/>
+            </w:pPr>
+            <w:r>
+              <w:rPr>
+                <w:rStyle w:val="VerbatimChar"/>
+              </w:rPr>
+              <w:t xml:space="preserve">image/tiff</w:t>
+            </w:r>
+          </w:p>
+        </w:tc>
+      </w:tr>
+    </w:tbl>
+    <w:p>
+      <w:pPr>
+        <w:pStyle w:val="BodyText"/>
+      </w:pPr>
+      <w:r>
+        <w:t xml:space="preserve">S3 proxy konfiguratsioonis (</w:t>
+      </w:r>
+      <w:r>
+        <w:rPr>
+          <w:rStyle w:val="VerbatimChar"/>
+        </w:rPr>
+        <w:t xml:space="preserve">docker-compose.yml</w:t>
+      </w:r>
+      <w:r>
+        <w:t xml:space="preserve">) on vaikimisi lubatud MIME-tüübid laiemad:</w:t>
+      </w:r>
+    </w:p>
+    <w:p>
+      <w:pPr>
+        <w:pStyle w:val="Compact"/>
+        <w:numPr>
+          <w:ilvl w:val="0"/>
+          <w:numId w:val="1021"/>
+        </w:numPr>
+      </w:pPr>
+      <w:r>
+        <w:rPr>
+          <w:rStyle w:val="VerbatimChar"/>
+        </w:rPr>
+        <w:t xml:space="preserve">application/pdf</w:t>
+      </w:r>
+    </w:p>
+    <w:p>
+      <w:pPr>
+        <w:pStyle w:val="Compact"/>
+        <w:numPr>
+          <w:ilvl w:val="0"/>
+          <w:numId w:val="1021"/>
+        </w:numPr>
+      </w:pPr>
+      <w:r>
+        <w:rPr>
+          <w:rStyle w:val="VerbatimChar"/>
+        </w:rPr>
+        <w:t xml:space="preserve">image/jpeg</w:t>
+      </w:r>
+    </w:p>
+    <w:p>
+      <w:pPr>
+        <w:pStyle w:val="Compact"/>
+        <w:numPr>
+          <w:ilvl w:val="0"/>
+          <w:numId w:val="1021"/>
+        </w:numPr>
+      </w:pPr>
+      <w:r>
+        <w:rPr>
+          <w:rStyle w:val="VerbatimChar"/>
+        </w:rPr>
+        <w:t xml:space="preserve">image/png</w:t>
+      </w:r>
+    </w:p>
+    <w:p>
+      <w:pPr>
+        <w:pStyle w:val="Compact"/>
+        <w:numPr>
+          <w:ilvl w:val="0"/>
+          <w:numId w:val="1021"/>
+        </w:numPr>
+      </w:pPr>
+      <w:r>
+        <w:rPr>
+          <w:rStyle w:val="VerbatimChar"/>
+        </w:rPr>
+        <w:t xml:space="preserve">application/vnd.etsi.asic-e+zip</w:t>
+      </w:r>
+      <w:r>
+        <w:t xml:space="preserve"> </w:t>
+      </w:r>
+      <w:r>
+        <w:t xml:space="preserve">(ASiC-e)</w:t>
+      </w:r>
+    </w:p>
+    <w:p>
+      <w:pPr>
+        <w:pStyle w:val="Compact"/>
+        <w:numPr>
+          <w:ilvl w:val="0"/>
+          <w:numId w:val="1021"/>
+        </w:numPr>
+      </w:pPr>
+      <w:r>
+        <w:rPr>
+          <w:rStyle w:val="VerbatimChar"/>
+        </w:rPr>
+        <w:t xml:space="preserve">application/msword</w:t>
+      </w:r>
+      <w:r>
+        <w:t xml:space="preserve"> </w:t>
+      </w:r>
+      <w:r>
+        <w:t xml:space="preserve">(DOC)</w:t>
+      </w:r>
+    </w:p>
+    <w:p>
+      <w:pPr>
+        <w:pStyle w:val="Compact"/>
+        <w:numPr>
+          <w:ilvl w:val="0"/>
+          <w:numId w:val="1021"/>
+        </w:numPr>
+      </w:pPr>
+      <w:r>
+        <w:rPr>
+          <w:rStyle w:val="VerbatimChar"/>
+        </w:rPr>
+        <w:t xml:space="preserve">application/vnd.openxmlformats-officedocument.wordprocessingml.document</w:t>
+      </w:r>
+      <w:r>
+        <w:t xml:space="preserve"> </w:t>
+      </w:r>
+      <w:r>
+        <w:t xml:space="preserve">(DOCX)</w:t>
+      </w:r>
+    </w:p>
+    <w:p>
+      <w:pPr>
+        <w:pStyle w:val="FirstParagraph"/>
+      </w:pPr>
+      <w:r>
+        <w:t xml:space="preserve">Suurusepiirangud:</w:t>
+      </w:r>
+    </w:p>
+    <w:tbl>
+      <w:tblPr>
+        <w:tblStyle w:val="Table"/>
+        <w:tblW w:type="auto" w:w="0"/>
+        <w:tblLook w:firstRow="1" w:lastRow="0" w:firstColumn="0" w:lastColumn="0" w:noHBand="0" w:noVBand="0" w:val="0020"/>
+      </w:tblPr>
+      <w:tblGrid>
+        <w:gridCol w:w="3960"/>
+        <w:gridCol w:w="3960"/>
+      </w:tblGrid>
+      <w:tr>
+        <w:trPr>
+          <w:tblHeader w:val="on"/>
+        </w:trPr>
+        <w:tc>
+          <w:tcPr/>
+          <w:p>
+            <w:pPr>
+              <w:pStyle w:val="Compact"/>
+            </w:pPr>
+            <w:r>
+              <w:t xml:space="preserve">Kiht</w:t>
+            </w:r>
+          </w:p>
+        </w:tc>
+        <w:tc>
+          <w:tcPr/>
+          <w:p>
+            <w:pPr>
+              <w:pStyle w:val="Compact"/>
+            </w:pPr>
+            <w:r>
+              <w:t xml:space="preserve">Piirang</w:t>
+            </w:r>
+          </w:p>
+        </w:tc>
+      </w:tr>
+      <w:tr>
+        <w:tc>
+          <w:tcPr/>
+          <w:p>
+            <w:pPr>
+              <w:pStyle w:val="Compact"/>
+            </w:pPr>
+            <w:r>
+              <w:t xml:space="preserve">Frontend</w:t>
+            </w:r>
+          </w:p>
+        </w:tc>
+        <w:tc>
+          <w:tcPr/>
+          <w:p>
+            <w:pPr>
+              <w:pStyle w:val="Compact"/>
+            </w:pPr>
+            <w:r>
+              <w:t xml:space="preserve">10 MB</w:t>
+            </w:r>
+          </w:p>
+        </w:tc>
+      </w:tr>
+      <w:tr>
+        <w:tc>
+          <w:tcPr/>
+          <w:p>
+            <w:pPr>
+              <w:pStyle w:val="Compact"/>
+            </w:pPr>
+            <w:r>
+              <w:t xml:space="preserve">S3 proxy (</w:t>
+            </w:r>
+            <w:r>
+              <w:rPr>
+                <w:rStyle w:val="VerbatimChar"/>
+              </w:rPr>
+              <w:t xml:space="preserve">S3_MAX_SIZE_MB</w:t>
+            </w:r>
+            <w:r>
+              <w:t xml:space="preserve">)</w:t>
+            </w:r>
+          </w:p>
+        </w:tc>
+        <w:tc>
+          <w:tcPr/>
+          <w:p>
+            <w:pPr>
+              <w:pStyle w:val="Compact"/>
+            </w:pPr>
+            <w:r>
+              <w:t xml:space="preserve">20 MB</w:t>
+            </w:r>
+          </w:p>
+        </w:tc>
+      </w:tr>
+      <w:tr>
+        <w:tc>
+          <w:tcPr/>
+          <w:p>
+            <w:pPr>
+              <w:pStyle w:val="Compact"/>
+            </w:pPr>
+            <w:r>
+              <w:t xml:space="preserve">Failinime pikkus (</w:t>
+            </w:r>
+            <w:r>
+              <w:rPr>
+                <w:rStyle w:val="VerbatimChar"/>
+              </w:rPr>
+              <w:t xml:space="preserve">S3_MAX_FILENAME_LENGTH</w:t>
+            </w:r>
+            <w:r>
+              <w:t xml:space="preserve">)</w:t>
+            </w:r>
+          </w:p>
+        </w:tc>
+        <w:tc>
+          <w:tcPr/>
+          <w:p>
+            <w:pPr>
+              <w:pStyle w:val="Compact"/>
+            </w:pPr>
+            <w:r>
+              <w:t xml:space="preserve">200 tähemärki</w:t>
+            </w:r>
+          </w:p>
+        </w:tc>
+      </w:tr>
+    </w:tbl>
+    <w:bookmarkEnd w:id="81"/>
+    <w:bookmarkStart w:id="85" w:name="kasutajaliidese-sammud-manuse-lisamiseks"/>
+    <w:p>
+      <w:pPr>
+        <w:pStyle w:val="Heading2"/>
+      </w:pPr>
+      <w:r>
+        <w:t xml:space="preserve">Kasutajaliidese sammud manuse lisamiseks</w:t>
+      </w:r>
+    </w:p>
+    <w:p>
+      <w:pPr>
+        <w:pStyle w:val="Compact"/>
+        <w:numPr>
+          <w:ilvl w:val="0"/>
+          <w:numId w:val="1022"/>
+        </w:numPr>
+      </w:pPr>
+      <w:r>
+        <w:t xml:space="preserve">Ava vorm, millele soovid faili lisada.</w:t>
+      </w:r>
+    </w:p>
+    <w:p>
+      <w:pPr>
+        <w:pStyle w:val="Compact"/>
+        <w:numPr>
+          <w:ilvl w:val="0"/>
+          <w:numId w:val="1022"/>
+        </w:numPr>
+      </w:pPr>
+      <w:r>
+        <w:t xml:space="preserve">Klõpsa plokis</w:t>
+      </w:r>
+      <w:r>
+        <w:t xml:space="preserve"> </w:t>
+      </w:r>
+      <w:r>
+        <w:rPr>
+          <w:b/>
+          <w:bCs/>
+        </w:rPr>
+        <w:t xml:space="preserve">Failid</w:t>
+      </w:r>
+      <w:r>
+        <w:t xml:space="preserve"> </w:t>
+      </w:r>
+      <w:r>
+        <w:t xml:space="preserve">(või sarnasel alal) nuppu</w:t>
+      </w:r>
+      <w:r>
+        <w:t xml:space="preserve"> </w:t>
+      </w:r>
+      <w:r>
+        <w:rPr>
+          <w:b/>
+          <w:bCs/>
+        </w:rPr>
+        <w:t xml:space="preserve">Lisa fail</w:t>
+      </w:r>
+      <w:r>
+        <w:t xml:space="preserve">.</w:t>
+      </w:r>
+    </w:p>
+    <w:p>
+      <w:pPr>
+        <w:pStyle w:val="Compact"/>
+        <w:numPr>
+          <w:ilvl w:val="0"/>
+          <w:numId w:val="1022"/>
+        </w:numPr>
+      </w:pPr>
+      <w:r>
+        <w:t xml:space="preserve">Vali arvutist lubatud fail.</w:t>
+      </w:r>
+    </w:p>
+    <w:p>
+      <w:pPr>
+        <w:pStyle w:val="Compact"/>
+        <w:numPr>
+          <w:ilvl w:val="0"/>
+          <w:numId w:val="1022"/>
+        </w:numPr>
+      </w:pPr>
+      <w:r>
+        <w:t xml:space="preserve">Kui vormi number on juba olemas, laaditakse fail automaatselt üles. Kui vormi number puudub, kuvatakse vihje: salvesta vorm kõigepealt.</w:t>
+      </w:r>
+    </w:p>
+    <w:p>
+      <w:pPr>
+        <w:pStyle w:val="Compact"/>
+        <w:numPr>
+          <w:ilvl w:val="0"/>
+          <w:numId w:val="1022"/>
+        </w:numPr>
+      </w:pPr>
+      <w:r>
+        <w:t xml:space="preserve">Pärast üleslaadimist kuvatakse fail loendis. Klõpsates faili nime, avatakse uues vahekaardis allalaadimise link.</w:t>
+      </w:r>
+    </w:p>
+    <w:p>
+      <w:pPr>
+        <w:pStyle w:val="FirstParagraph"/>
+      </w:pPr>
+      <w:r>
+        <w:drawing>
+          <wp:inline>
+            <wp:extent cx="5334000" cy="333375"/>
+            <wp:effectExtent b="0" l="0" r="0" t="0"/>
+            <wp:docPr descr="" title="" id="83" name="Picture"/>
+            <a:graphic>
+              <a:graphicData uri="http://schemas.openxmlformats.org/drawingml/2006/picture">
+                <pic:pic>
+                  <pic:nvPicPr>
+                    <pic:cNvPr descr="_mermaid_images/mermaid_1_6badd94f4b.png" id="84" name="Picture"/>
+                    <pic:cNvPicPr>
+                      <a:picLocks noChangeArrowheads="1" noChangeAspect="1"/>
+                    </pic:cNvPicPr>
+                  </pic:nvPicPr>
+                  <pic:blipFill>
+                    <a:blip r:embed="rId82"/>
+                    <a:stretch>
+                      <a:fillRect/>
+                    </a:stretch>
+                  </pic:blipFill>
+                  <pic:spPr bwMode="auto">
+                    <a:xfrm>
+                      <a:off x="0" y="0"/>
+                      <a:ext cx="5334000" cy="333375"/>
+                    </a:xfrm>
+                    <a:prstGeom prst="rect">
+                      <a:avLst/>
+                    </a:prstGeom>
+                    <a:noFill/>
+                    <a:ln w="9525">
+                      <a:noFill/>
+                      <a:headEnd/>
+                      <a:tailEnd/>
+                    </a:ln>
+                  </pic:spPr>
+                </pic:pic>
+              </a:graphicData>
+            </a:graphic>
+          </wp:inline>
+        </w:drawing>
+      </w:r>
+    </w:p>
+    <w:bookmarkEnd w:id="85"/>
+    <w:bookmarkStart w:id="88" w:name="tehniline-hoiustamine"/>
+    <w:p>
+      <w:pPr>
+        <w:pStyle w:val="Heading2"/>
+      </w:pPr>
+      <w:r>
+        <w:t xml:space="preserve">Tehniline hoiustamine</w:t>
+      </w:r>
+    </w:p>
+    <w:bookmarkStart w:id="86" w:name="s3-võti"/>
+    <w:p>
+      <w:pPr>
+        <w:pStyle w:val="Heading3"/>
+      </w:pPr>
+      <w:r>
+        <w:t xml:space="preserve">S3 võti</w:t>
+      </w:r>
+    </w:p>
+    <w:p>
+      <w:pPr>
+        <w:pStyle w:val="FirstParagraph"/>
+      </w:pPr>
+      <w:r>
+        <w:t xml:space="preserve">Iga fail salvestatakse S3-s kausta, mis on moodustatud vormi tüübist ja numbrist:</w:t>
+      </w:r>
+    </w:p>
+    <w:p>
+      <w:pPr>
+        <w:pStyle w:val="SourceCode"/>
+      </w:pPr>
+      <w:r>
+        <w:rPr>
+          <w:rStyle w:val="VerbatimChar"/>
+        </w:rPr>
+        <w:t xml:space="preserve">&lt;form_type&gt;/&lt;form_number&gt;/&lt;file_name&gt;</w:t>
+      </w:r>
+    </w:p>
+    <w:p>
+      <w:pPr>
+        <w:pStyle w:val="FirstParagraph"/>
+      </w:pPr>
+      <w:r>
+        <w:t xml:space="preserve">Näide:</w:t>
+      </w:r>
+    </w:p>
+    <w:p>
+      <w:pPr>
+        <w:pStyle w:val="SourceCode"/>
+      </w:pPr>
+      <w:r>
+        <w:rPr>
+          <w:rStyle w:val="VerbatimChar"/>
+        </w:rPr>
+        <w:t xml:space="preserve">foreign-violation-form/vr-2026-00123/luba.pdf</w:t>
+      </w:r>
+    </w:p>
+    <w:bookmarkEnd w:id="86"/>
+    <w:bookmarkStart w:id="87" w:name="andmebaasi-kirje"/>
+    <w:p>
+      <w:pPr>
+        <w:pStyle w:val="Heading3"/>
+      </w:pPr>
+      <w:r>
+        <w:t xml:space="preserve">Andmebaasi kirje</w:t>
+      </w:r>
+    </w:p>
+    <w:p>
+      <w:pPr>
+        <w:pStyle w:val="FirstParagraph"/>
+      </w:pPr>
+      <w:r>
+        <w:t xml:space="preserve">Andmebaasi tabelis</w:t>
+      </w:r>
+      <w:r>
+        <w:t xml:space="preserve"> </w:t>
+      </w:r>
+      <w:r>
+        <w:rPr>
+          <w:rStyle w:val="VerbatimChar"/>
+        </w:rPr>
+        <w:t xml:space="preserve">forms.form_attachment</w:t>
+      </w:r>
+      <w:r>
+        <w:t xml:space="preserve"> </w:t>
+      </w:r>
+      <w:r>
+        <w:t xml:space="preserve">hoitakse:</w:t>
+      </w:r>
+    </w:p>
+    <w:tbl>
+      <w:tblPr>
+        <w:tblStyle w:val="Table"/>
+        <w:tblW w:type="auto" w:w="0"/>
+        <w:tblLook w:firstRow="1" w:lastRow="0" w:firstColumn="0" w:lastColumn="0" w:noHBand="0" w:noVBand="0" w:val="0020"/>
+      </w:tblPr>
+      <w:tblGrid>
+        <w:gridCol w:w="3960"/>
+        <w:gridCol w:w="3960"/>
+      </w:tblGrid>
+      <w:tr>
+        <w:trPr>
+          <w:tblHeader w:val="on"/>
+        </w:trPr>
+        <w:tc>
+          <w:tcPr/>
+          <w:p>
+            <w:pPr>
+              <w:pStyle w:val="Compact"/>
+            </w:pPr>
+            <w:r>
+              <w:t xml:space="preserve">Väli</w:t>
+            </w:r>
+          </w:p>
+        </w:tc>
+        <w:tc>
+          <w:tcPr/>
+          <w:p>
+            <w:pPr>
+              <w:pStyle w:val="Compact"/>
+            </w:pPr>
+            <w:r>
+              <w:t xml:space="preserve">Selgitus</w:t>
+            </w:r>
+          </w:p>
+        </w:tc>
+      </w:tr>
+      <w:tr>
+        <w:tc>
+          <w:tcPr/>
+          <w:p>
+            <w:pPr>
+              <w:pStyle w:val="Compact"/>
+            </w:pPr>
+            <w:r>
+              <w:rPr>
+                <w:rStyle w:val="VerbatimChar"/>
+              </w:rPr>
+              <w:t xml:space="preserve">id</w:t>
+            </w:r>
+          </w:p>
+        </w:tc>
+        <w:tc>
+          <w:tcPr/>
+          <w:p>
+            <w:pPr>
+              <w:pStyle w:val="Compact"/>
+            </w:pPr>
+            <w:r>
+              <w:t xml:space="preserve">Unikaalne kirje ID</w:t>
+            </w:r>
+          </w:p>
+        </w:tc>
+      </w:tr>
+      <w:tr>
+        <w:tc>
+          <w:tcPr/>
+          <w:p>
+            <w:pPr>
+              <w:pStyle w:val="Compact"/>
+            </w:pPr>
+            <w:r>
+              <w:rPr>
+                <w:rStyle w:val="VerbatimChar"/>
+              </w:rPr>
+              <w:t xml:space="preserve">form_number</w:t>
+            </w:r>
+          </w:p>
+        </w:tc>
+        <w:tc>
+          <w:tcPr/>
+          <w:p>
+            <w:pPr>
+              <w:pStyle w:val="Compact"/>
+            </w:pPr>
+            <w:r>
+              <w:t xml:space="preserve">Vormi number</w:t>
+            </w:r>
+          </w:p>
+        </w:tc>
+      </w:tr>
+      <w:tr>
+        <w:tc>
+          <w:tcPr/>
+          <w:p>
+            <w:pPr>
+              <w:pStyle w:val="Compact"/>
+            </w:pPr>
+            <w:r>
+              <w:rPr>
+                <w:rStyle w:val="VerbatimChar"/>
+              </w:rPr>
+              <w:t xml:space="preserve">file_name</w:t>
+            </w:r>
+          </w:p>
+        </w:tc>
+        <w:tc>
+          <w:tcPr/>
+          <w:p>
+            <w:pPr>
+              <w:pStyle w:val="Compact"/>
+            </w:pPr>
+            <w:r>
+              <w:t xml:space="preserve">Originaalne failinimi</w:t>
+            </w:r>
+          </w:p>
+        </w:tc>
+      </w:tr>
+      <w:tr>
+        <w:tc>
+          <w:tcPr/>
+          <w:p>
+            <w:pPr>
+              <w:pStyle w:val="Compact"/>
+            </w:pPr>
+            <w:r>
+              <w:rPr>
+                <w:rStyle w:val="VerbatimChar"/>
+              </w:rPr>
+              <w:t xml:space="preserve">s3_key</w:t>
+            </w:r>
+          </w:p>
+        </w:tc>
+        <w:tc>
+          <w:tcPr/>
+          <w:p>
+            <w:pPr>
+              <w:pStyle w:val="Compact"/>
+            </w:pPr>
+            <w:r>
+              <w:t xml:space="preserve">Täielik S3 objekti võti</w:t>
+            </w:r>
+          </w:p>
+        </w:tc>
+      </w:tr>
+      <w:tr>
+        <w:tc>
+          <w:tcPr/>
+          <w:p>
+            <w:pPr>
+              <w:pStyle w:val="Compact"/>
+            </w:pPr>
+            <w:r>
+              <w:rPr>
+                <w:rStyle w:val="VerbatimChar"/>
+              </w:rPr>
+              <w:t xml:space="preserve">status</w:t>
+            </w:r>
+          </w:p>
+        </w:tc>
+        <w:tc>
+          <w:tcPr/>
+          <w:p>
+            <w:pPr>
+              <w:pStyle w:val="Compact"/>
+            </w:pPr>
+            <w:r>
+              <w:rPr>
+                <w:rStyle w:val="VerbatimChar"/>
+              </w:rPr>
+              <w:t xml:space="preserve">active</w:t>
+            </w:r>
+            <w:r>
+              <w:t xml:space="preserve"> </w:t>
+            </w:r>
+            <w:r>
+              <w:t xml:space="preserve">või</w:t>
+            </w:r>
+            <w:r>
+              <w:t xml:space="preserve"> </w:t>
+            </w:r>
+            <w:r>
+              <w:rPr>
+                <w:rStyle w:val="VerbatimChar"/>
+              </w:rPr>
+              <w:t xml:space="preserve">deleted</w:t>
+            </w:r>
+          </w:p>
+        </w:tc>
+      </w:tr>
+      <w:tr>
+        <w:tc>
+          <w:tcPr/>
+          <w:p>
+            <w:pPr>
+              <w:pStyle w:val="Compact"/>
+            </w:pPr>
+            <w:r>
+              <w:rPr>
+                <w:rStyle w:val="VerbatimChar"/>
+              </w:rPr>
+              <w:t xml:space="preserve">created_at</w:t>
+            </w:r>
+          </w:p>
+        </w:tc>
+        <w:tc>
+          <w:tcPr/>
+          <w:p>
+            <w:pPr>
+              <w:pStyle w:val="Compact"/>
+            </w:pPr>
+            <w:r>
+              <w:t xml:space="preserve">Üleslaadimise aeg</w:t>
+            </w:r>
+          </w:p>
+        </w:tc>
+      </w:tr>
+      <w:tr>
+        <w:tc>
+          <w:tcPr/>
+          <w:p>
+            <w:pPr>
+              <w:pStyle w:val="Compact"/>
+            </w:pPr>
+            <w:r>
+              <w:rPr>
+                <w:rStyle w:val="VerbatimChar"/>
+              </w:rPr>
+              <w:t xml:space="preserve">created_by</w:t>
+            </w:r>
+          </w:p>
+        </w:tc>
+        <w:tc>
+          <w:tcPr/>
+          <w:p>
+            <w:pPr>
+              <w:pStyle w:val="Compact"/>
+            </w:pPr>
+            <w:r>
+              <w:t xml:space="preserve">Laadija isikukood</w:t>
+            </w:r>
+          </w:p>
+        </w:tc>
+      </w:tr>
+    </w:tbl>
+    <w:bookmarkEnd w:id="87"/>
+    <w:bookmarkEnd w:id="88"/>
+    <w:bookmarkStart w:id="89" w:name="kustutamine-on-pehme"/>
+    <w:p>
+      <w:pPr>
+        <w:pStyle w:val="Heading2"/>
+      </w:pPr>
+      <w:r>
+        <w:t xml:space="preserve">Kustutamine on pehme</w:t>
+      </w:r>
+    </w:p>
+    <w:p>
+      <w:pPr>
+        <w:pStyle w:val="FirstParagraph"/>
+      </w:pPr>
+      <w:r>
+        <w:t xml:space="preserve">Kasutajaliideses kustutatud manus ei kustu S3-st, vaid märgistatakse andmebaasis staatusega</w:t>
+      </w:r>
+      <w:r>
+        <w:t xml:space="preserve"> </w:t>
+      </w:r>
+      <w:r>
+        <w:rPr>
+          <w:rStyle w:val="VerbatimChar"/>
+        </w:rPr>
+        <w:t xml:space="preserve">deleted</w:t>
+      </w:r>
+      <w:r>
+        <w:t xml:space="preserve">. See tähendab, et faili sisu on endiselt S3-s olemas, kuid seda ei kuvata enam vormi vaates.</w:t>
+      </w:r>
+    </w:p>
+    <w:bookmarkEnd w:id="89"/>
+    <w:bookmarkStart w:id="93" w:name="ajalooline-vaade"/>
+    <w:p>
+      <w:pPr>
+        <w:pStyle w:val="Heading2"/>
+      </w:pPr>
+      <w:r>
+        <w:t xml:space="preserve">Ajalooline vaade</w:t>
+      </w:r>
+    </w:p>
+    <w:bookmarkStart w:id="90" w:name="andmebaasi-kaudu"/>
+    <w:p>
+      <w:pPr>
+        <w:pStyle w:val="Heading3"/>
+      </w:pPr>
+      <w:r>
+        <w:t xml:space="preserve">Andmebaasi kaudu</w:t>
+      </w:r>
+    </w:p>
+    <w:p>
+      <w:pPr>
+        <w:pStyle w:val="FirstParagraph"/>
+      </w:pPr>
+      <w:r>
+        <w:t xml:space="preserve">Iga üleslaadimise ja kustutamise tegevus jääb kirja tabelisse</w:t>
+      </w:r>
+      <w:r>
+        <w:t xml:space="preserve"> </w:t>
+      </w:r>
+      <w:r>
+        <w:rPr>
+          <w:rStyle w:val="VerbatimChar"/>
+        </w:rPr>
+        <w:t xml:space="preserve">forms.form_attachment</w:t>
+      </w:r>
+      <w:r>
+        <w:t xml:space="preserve">. Administraator saab päringuga näha:</w:t>
+      </w:r>
+    </w:p>
+    <w:p>
+      <w:pPr>
+        <w:pStyle w:val="Compact"/>
+        <w:numPr>
+          <w:ilvl w:val="0"/>
+          <w:numId w:val="1023"/>
+        </w:numPr>
+      </w:pPr>
+      <w:r>
+        <w:t xml:space="preserve">kõiki üleslaaditud faile kindla vormi numbri kohta</w:t>
+      </w:r>
+    </w:p>
+    <w:p>
+      <w:pPr>
+        <w:pStyle w:val="Compact"/>
+        <w:numPr>
+          <w:ilvl w:val="0"/>
+          <w:numId w:val="1023"/>
+        </w:numPr>
+      </w:pPr>
+      <w:r>
+        <w:t xml:space="preserve">iga faili laadimise ja kustutamise aega</w:t>
+      </w:r>
+    </w:p>
+    <w:p>
+      <w:pPr>
+        <w:pStyle w:val="Compact"/>
+        <w:numPr>
+          <w:ilvl w:val="0"/>
+          <w:numId w:val="1023"/>
+        </w:numPr>
+      </w:pPr>
+      <w:r>
+        <w:t xml:space="preserve">kes faili üles laadis või kustutas</w:t>
+      </w:r>
+    </w:p>
+    <w:p>
+      <w:pPr>
+        <w:pStyle w:val="Compact"/>
+        <w:numPr>
+          <w:ilvl w:val="0"/>
+          <w:numId w:val="1023"/>
+        </w:numPr>
+      </w:pPr>
+      <w:r>
+        <w:t xml:space="preserve">millised failid on aktiivsed ja millised kustutatud</w:t>
+      </w:r>
+    </w:p>
+    <w:p>
+      <w:pPr>
+        <w:pStyle w:val="FirstParagraph"/>
+      </w:pPr>
+      <w:r>
+        <w:t xml:space="preserve">Kui sama nimega fail uuesti üles laetakse, luuakse uus andmebaasi kirje, kuid S3 võti jääb samaks. Seega näitab</w:t>
+      </w:r>
+      <w:r>
+        <w:t xml:space="preserve"> </w:t>
+      </w:r>
+      <w:r>
+        <w:rPr>
+          <w:rStyle w:val="VerbatimChar"/>
+        </w:rPr>
+        <w:t xml:space="preserve">forms.form_attachment</w:t>
+      </w:r>
+      <w:r>
+        <w:t xml:space="preserve"> </w:t>
+      </w:r>
+      <w:r>
+        <w:t xml:space="preserve">üleslaadimiste ajalugu, kuid mitte alati iga versiooni sisu (kui S3 versioning ei ole lubatud).</w:t>
+      </w:r>
+    </w:p>
+    <w:bookmarkEnd w:id="90"/>
+    <w:bookmarkStart w:id="91" w:name="s3-versioning"/>
+    <w:p>
+      <w:pPr>
+        <w:pStyle w:val="Heading3"/>
+      </w:pPr>
+      <w:r>
+        <w:t xml:space="preserve">S3 versioning</w:t>
+      </w:r>
+    </w:p>
+    <w:p>
+      <w:pPr>
+        <w:pStyle w:val="FirstParagraph"/>
+      </w:pPr>
+      <w:r>
+        <w:t xml:space="preserve">Kui S3 bucketis on lubatud</w:t>
+      </w:r>
+      <w:r>
+        <w:t xml:space="preserve"> </w:t>
+      </w:r>
+      <w:r>
+        <w:rPr>
+          <w:b/>
+          <w:bCs/>
+        </w:rPr>
+        <w:t xml:space="preserve">S3 versioning</w:t>
+      </w:r>
+      <w:r>
+        <w:t xml:space="preserve">, salvestatakse sama võtme all ka varasemad versioonid. See võimaldab administraatoril taastada või vaadata vanemaid faile otse S3 konsooli või AWS CLI kaudu.</w:t>
+      </w:r>
+    </w:p>
+    <w:p>
+      <w:pPr>
+        <w:pStyle w:val="BodyText"/>
+      </w:pPr>
+      <w:r>
+        <w:t xml:space="preserve">Näide S3 CLI-ga vanemate versioonide vaatamiseks:</w:t>
+      </w:r>
+    </w:p>
+    <w:p>
+      <w:pPr>
+        <w:pStyle w:val="SourceCode"/>
+      </w:pPr>
+      <w:r>
+        <w:rPr>
+          <w:rStyle w:val="ExtensionTok"/>
+        </w:rPr>
+        <w:t xml:space="preserve">aws</w:t>
+      </w:r>
+      <w:r>
+        <w:rPr>
+          <w:rStyle w:val="NormalTok"/>
+        </w:rPr>
+        <w:t xml:space="preserve"> s3api list-object-versions </w:t>
+      </w:r>
+      <w:r>
+        <w:rPr>
+          <w:rStyle w:val="DataTypeTok"/>
+        </w:rPr>
+        <w:t xml:space="preserve">\</w:t>
+      </w:r>
+      <w:r>
+        <w:br/>
+      </w:r>
+      <w:r>
+        <w:rPr>
+          <w:rStyle w:val="NormalTok"/>
+        </w:rPr>
+        <w:t xml:space="preserve">  </w:t>
+      </w:r>
+      <w:r>
+        <w:rPr>
+          <w:rStyle w:val="AttributeTok"/>
+        </w:rPr>
+        <w:t xml:space="preserve">--bucket</w:t>
+      </w:r>
+      <w:r>
+        <w:rPr>
+          <w:rStyle w:val="NormalTok"/>
+        </w:rPr>
+        <w:t xml:space="preserve"> </w:t>
+      </w:r>
+      <w:r>
+        <w:rPr>
+          <w:rStyle w:val="OperatorTok"/>
+        </w:rPr>
+        <w:t xml:space="preserve">&lt;</w:t>
+      </w:r>
+      <w:r>
+        <w:rPr>
+          <w:rStyle w:val="NormalTok"/>
+        </w:rPr>
+        <w:t xml:space="preserve">bucket-name</w:t>
+      </w:r>
+      <w:r>
+        <w:rPr>
+          <w:rStyle w:val="OperatorTok"/>
+        </w:rPr>
+        <w:t xml:space="preserve">&gt;</w:t>
+      </w:r>
+      <w:r>
+        <w:rPr>
+          <w:rStyle w:val="NormalTok"/>
+        </w:rPr>
+        <w:t xml:space="preserve"> </w:t>
+      </w:r>
+      <w:r>
+        <w:rPr>
+          <w:rStyle w:val="DataTypeTok"/>
+        </w:rPr>
+        <w:t xml:space="preserve">\</w:t>
+      </w:r>
+      <w:r>
+        <w:br/>
+      </w:r>
+      <w:r>
+        <w:rPr>
+          <w:rStyle w:val="NormalTok"/>
+        </w:rPr>
+        <w:t xml:space="preserve">  </w:t>
+      </w:r>
+      <w:r>
+        <w:rPr>
+          <w:rStyle w:val="AttributeTok"/>
+        </w:rPr>
+        <w:t xml:space="preserve">--prefix</w:t>
+      </w:r>
+      <w:r>
+        <w:rPr>
+          <w:rStyle w:val="NormalTok"/>
+        </w:rPr>
+        <w:t xml:space="preserve"> foreign-violation-form/vr-2026-00123/ </w:t>
+      </w:r>
+      <w:r>
+        <w:rPr>
+          <w:rStyle w:val="DataTypeTok"/>
+        </w:rPr>
+        <w:t xml:space="preserve">\</w:t>
+      </w:r>
+      <w:r>
+        <w:br/>
+      </w:r>
+      <w:r>
+        <w:rPr>
+          <w:rStyle w:val="NormalTok"/>
+        </w:rPr>
+        <w:t xml:space="preserve">  </w:t>
+      </w:r>
+      <w:r>
+        <w:rPr>
+          <w:rStyle w:val="AttributeTok"/>
+        </w:rPr>
+        <w:t xml:space="preserve">--query</w:t>
+      </w:r>
+      <w:r>
+        <w:rPr>
+          <w:rStyle w:val="NormalTok"/>
+        </w:rPr>
+        <w:t xml:space="preserve"> </w:t>
+      </w:r>
+      <w:r>
+        <w:rPr>
+          <w:rStyle w:val="StringTok"/>
+        </w:rPr>
+        <w:t xml:space="preserve">'Versions[*].[Key,VersionId,LastModified,Size]'</w:t>
+      </w:r>
+    </w:p>
+    <w:p>
+      <w:pPr>
+        <w:pStyle w:val="FirstParagraph"/>
+      </w:pPr>
+      <w:r>
+        <w:t xml:space="preserve">Vanema versiooni allalaadimiseks:</w:t>
+      </w:r>
+    </w:p>
+    <w:p>
+      <w:pPr>
+        <w:pStyle w:val="SourceCode"/>
+      </w:pPr>
+      <w:r>
+        <w:rPr>
+          <w:rStyle w:val="ExtensionTok"/>
+        </w:rPr>
+        <w:t xml:space="preserve">aws</w:t>
+      </w:r>
+      <w:r>
+        <w:rPr>
+          <w:rStyle w:val="NormalTok"/>
+        </w:rPr>
+        <w:t xml:space="preserve"> s3api get-object </w:t>
+      </w:r>
+      <w:r>
+        <w:rPr>
+          <w:rStyle w:val="DataTypeTok"/>
+        </w:rPr>
+        <w:t xml:space="preserve">\</w:t>
+      </w:r>
+      <w:r>
+        <w:br/>
+      </w:r>
+      <w:r>
+        <w:rPr>
+          <w:rStyle w:val="NormalTok"/>
+        </w:rPr>
+        <w:t xml:space="preserve">  </w:t>
+      </w:r>
+      <w:r>
+        <w:rPr>
+          <w:rStyle w:val="AttributeTok"/>
+        </w:rPr>
+        <w:t xml:space="preserve">--bucket</w:t>
+      </w:r>
+      <w:r>
+        <w:rPr>
+          <w:rStyle w:val="NormalTok"/>
+        </w:rPr>
+        <w:t xml:space="preserve"> </w:t>
+      </w:r>
+      <w:r>
+        <w:rPr>
+          <w:rStyle w:val="OperatorTok"/>
+        </w:rPr>
+        <w:t xml:space="preserve">&lt;</w:t>
+      </w:r>
+      <w:r>
+        <w:rPr>
+          <w:rStyle w:val="NormalTok"/>
+        </w:rPr>
+        <w:t xml:space="preserve">bucket-name</w:t>
+      </w:r>
+      <w:r>
+        <w:rPr>
+          <w:rStyle w:val="OperatorTok"/>
+        </w:rPr>
+        <w:t xml:space="preserve">&gt;</w:t>
+      </w:r>
+      <w:r>
+        <w:rPr>
+          <w:rStyle w:val="NormalTok"/>
+        </w:rPr>
+        <w:t xml:space="preserve"> </w:t>
+      </w:r>
+      <w:r>
+        <w:rPr>
+          <w:rStyle w:val="DataTypeTok"/>
+        </w:rPr>
+        <w:t xml:space="preserve">\</w:t>
+      </w:r>
+      <w:r>
+        <w:br/>
+      </w:r>
+      <w:r>
+        <w:rPr>
+          <w:rStyle w:val="NormalTok"/>
+        </w:rPr>
+        <w:t xml:space="preserve">  </w:t>
+      </w:r>
+      <w:r>
+        <w:rPr>
+          <w:rStyle w:val="AttributeTok"/>
+        </w:rPr>
+        <w:t xml:space="preserve">--key</w:t>
+      </w:r>
+      <w:r>
+        <w:rPr>
+          <w:rStyle w:val="NormalTok"/>
+        </w:rPr>
+        <w:t xml:space="preserve"> foreign-violation-form/vr-2026-00123/luba.pdf </w:t>
+      </w:r>
+      <w:r>
+        <w:rPr>
+          <w:rStyle w:val="DataTypeTok"/>
+        </w:rPr>
+        <w:t xml:space="preserve">\</w:t>
+      </w:r>
+      <w:r>
+        <w:br/>
+      </w:r>
+      <w:r>
+        <w:rPr>
+          <w:rStyle w:val="NormalTok"/>
+        </w:rPr>
+        <w:t xml:space="preserve">  </w:t>
+      </w:r>
+      <w:r>
+        <w:rPr>
+          <w:rStyle w:val="AttributeTok"/>
+        </w:rPr>
+        <w:t xml:space="preserve">--version-id</w:t>
+      </w:r>
+      <w:r>
+        <w:rPr>
+          <w:rStyle w:val="NormalTok"/>
+        </w:rPr>
+        <w:t xml:space="preserve"> </w:t>
+      </w:r>
+      <w:r>
+        <w:rPr>
+          <w:rStyle w:val="OperatorTok"/>
+        </w:rPr>
+        <w:t xml:space="preserve">&lt;</w:t>
+      </w:r>
+      <w:r>
+        <w:rPr>
+          <w:rStyle w:val="NormalTok"/>
+        </w:rPr>
+        <w:t xml:space="preserve">version-id</w:t>
+      </w:r>
+      <w:r>
+        <w:rPr>
+          <w:rStyle w:val="OperatorTok"/>
+        </w:rPr>
+        <w:t xml:space="preserve">&gt;</w:t>
+      </w:r>
+      <w:r>
+        <w:rPr>
+          <w:rStyle w:val="NormalTok"/>
+        </w:rPr>
+        <w:t xml:space="preserve"> </w:t>
+      </w:r>
+      <w:r>
+        <w:rPr>
+          <w:rStyle w:val="DataTypeTok"/>
+        </w:rPr>
+        <w:t xml:space="preserve">\</w:t>
+      </w:r>
+      <w:r>
+        <w:br/>
+      </w:r>
+      <w:r>
+        <w:rPr>
+          <w:rStyle w:val="NormalTok"/>
+        </w:rPr>
+        <w:t xml:space="preserve">  luba_vana.pdf</w:t>
+      </w:r>
+    </w:p>
+    <w:bookmarkEnd w:id="91"/>
+    <w:bookmarkStart w:id="92" w:name="kasutajaliidese-võimalused"/>
+    <w:p>
+      <w:pPr>
+        <w:pStyle w:val="Heading3"/>
+      </w:pPr>
+      <w:r>
+        <w:t xml:space="preserve">Kasutajaliidese võimalused</w:t>
+      </w:r>
+    </w:p>
+    <w:p>
+      <w:pPr>
+        <w:pStyle w:val="FirstParagraph"/>
+      </w:pPr>
+      <w:r>
+        <w:t xml:space="preserve">Praeguses LJVIS2 liideses kuvatakse vormi vaates ainult aktiivsed manused. Kustutatud või varasemate versioonide taastamiseks tuleb administraatoril:</w:t>
+      </w:r>
+    </w:p>
+    <w:p>
+      <w:pPr>
+        <w:pStyle w:val="Compact"/>
+        <w:numPr>
+          <w:ilvl w:val="0"/>
+          <w:numId w:val="1024"/>
+        </w:numPr>
+      </w:pPr>
+      <w:r>
+        <w:t xml:space="preserve">päringuid teha otse andmebaasi või auditilogi kaudu, et leida</w:t>
+      </w:r>
+      <w:r>
+        <w:t xml:space="preserve"> </w:t>
+      </w:r>
+      <w:r>
+        <w:rPr>
+          <w:rStyle w:val="VerbatimChar"/>
+        </w:rPr>
+        <w:t xml:space="preserve">s3_key</w:t>
+      </w:r>
+      <w:r>
+        <w:t xml:space="preserve"> </w:t>
+      </w:r>
+      <w:r>
+        <w:t xml:space="preserve">ja ajatemplid</w:t>
+      </w:r>
+    </w:p>
+    <w:p>
+      <w:pPr>
+        <w:pStyle w:val="Compact"/>
+        <w:numPr>
+          <w:ilvl w:val="0"/>
+          <w:numId w:val="1024"/>
+        </w:numPr>
+      </w:pPr>
+      <w:r>
+        <w:t xml:space="preserve">kasutada S3 konsooli või CLI-d, kui versioning on lubatud</w:t>
+      </w:r>
+    </w:p>
+    <w:p>
+      <w:pPr>
+        <w:pStyle w:val="Compact"/>
+        <w:numPr>
+          <w:ilvl w:val="0"/>
+          <w:numId w:val="1024"/>
+        </w:numPr>
+      </w:pPr>
+      <w:r>
+        <w:t xml:space="preserve">vajadusel taastada</w:t>
+      </w:r>
+      <w:r>
+        <w:t xml:space="preserve"> </w:t>
+      </w:r>
+      <w:r>
+        <w:rPr>
+          <w:rStyle w:val="VerbatimChar"/>
+        </w:rPr>
+        <w:t xml:space="preserve">forms.form_attachment</w:t>
+      </w:r>
+      <w:r>
+        <w:t xml:space="preserve"> </w:t>
+      </w:r>
+      <w:r>
+        <w:t xml:space="preserve">kirje staatus</w:t>
+      </w:r>
+      <w:r>
+        <w:t xml:space="preserve"> </w:t>
+      </w:r>
+      <w:r>
+        <w:rPr>
+          <w:rStyle w:val="VerbatimChar"/>
+        </w:rPr>
+        <w:t xml:space="preserve">active</w:t>
+      </w:r>
+      <w:r>
+        <w:t xml:space="preserve">-ks</w:t>
+      </w:r>
+    </w:p>
+    <w:bookmarkEnd w:id="92"/>
+    <w:bookmarkEnd w:id="93"/>
+    <w:bookmarkStart w:id="94" w:name="auditilogi-1"/>
+    <w:p>
+      <w:pPr>
+        <w:pStyle w:val="Heading2"/>
+      </w:pPr>
+      <w:r>
+        <w:t xml:space="preserve">Auditilogi</w:t>
+      </w:r>
+    </w:p>
+    <w:p>
+      <w:pPr>
+        <w:pStyle w:val="FirstParagraph"/>
+      </w:pPr>
+      <w:r>
+        <w:t xml:space="preserve">Manuste üleslaadimine, allalaadimine ja kustutamine logitakse auditilogi sündmustega:</w:t>
+      </w:r>
+    </w:p>
+    <w:p>
+      <w:pPr>
+        <w:pStyle w:val="Compact"/>
+        <w:numPr>
+          <w:ilvl w:val="0"/>
+          <w:numId w:val="1025"/>
+        </w:numPr>
+      </w:pPr>
+      <w:r>
+        <w:rPr>
+          <w:rStyle w:val="VerbatimChar"/>
+        </w:rPr>
+        <w:t xml:space="preserve">form.file.upload</w:t>
+      </w:r>
+    </w:p>
+    <w:p>
+      <w:pPr>
+        <w:pStyle w:val="Compact"/>
+        <w:numPr>
+          <w:ilvl w:val="0"/>
+          <w:numId w:val="1025"/>
+        </w:numPr>
+      </w:pPr>
+      <w:r>
+        <w:rPr>
+          <w:rStyle w:val="VerbatimChar"/>
+        </w:rPr>
+        <w:t xml:space="preserve">form.file.download</w:t>
+      </w:r>
+    </w:p>
+    <w:p>
+      <w:pPr>
+        <w:pStyle w:val="Compact"/>
+        <w:numPr>
+          <w:ilvl w:val="0"/>
+          <w:numId w:val="1025"/>
+        </w:numPr>
+      </w:pPr>
+      <w:r>
+        <w:rPr>
+          <w:rStyle w:val="VerbatimChar"/>
+        </w:rPr>
+        <w:t xml:space="preserve">form.file.delete</w:t>
+      </w:r>
+    </w:p>
+    <w:p>
+      <w:pPr>
+        <w:pStyle w:val="FirstParagraph"/>
+      </w:pPr>
+      <w:r>
+        <w:t xml:space="preserve">Iga sündmus sisaldab faili nime, vormi numbrit,</w:t>
+      </w:r>
+      <w:r>
+        <w:t xml:space="preserve"> </w:t>
+      </w:r>
+      <w:r>
+        <w:rPr>
+          <w:rStyle w:val="VerbatimChar"/>
+        </w:rPr>
+        <w:t xml:space="preserve">s3_key</w:t>
+      </w:r>
+      <w:r>
+        <w:t xml:space="preserve">-d ja tegija andmeid.</w:t>
+      </w:r>
+    </w:p>
+    <w:bookmarkEnd w:id="94"/>
+    <w:bookmarkStart w:id="95" w:name="api-lõpp-punktid"/>
+    <w:p>
+      <w:pPr>
+        <w:pStyle w:val="Heading2"/>
+      </w:pPr>
+      <w:r>
+        <w:t xml:space="preserve">API lõpp-punktid</w:t>
+      </w:r>
+    </w:p>
+    <w:tbl>
+      <w:tblPr>
+        <w:tblStyle w:val="Table"/>
+        <w:tblW w:type="pct" w:w="5000"/>
+        <w:tblLayout w:type="fixed"/>
+        <w:tblLook w:firstRow="1" w:lastRow="0" w:firstColumn="0" w:lastColumn="0" w:noHBand="0" w:noVBand="0" w:val="0020"/>
+      </w:tblPr>
+      <w:tblGrid>
+        <w:gridCol w:w="2640"/>
+        <w:gridCol w:w="2640"/>
+        <w:gridCol w:w="2640"/>
+      </w:tblGrid>
+      <w:tr>
+        <w:trPr>
+          <w:tblHeader w:val="on"/>
+        </w:trPr>
+        <w:tc>
+          <w:tcPr/>
+          <w:p>
+            <w:pPr>
+              <w:pStyle w:val="Compact"/>
+            </w:pPr>
+            <w:r>
+              <w:t xml:space="preserve">Meetod</w:t>
+            </w:r>
+          </w:p>
+        </w:tc>
+        <w:tc>
+          <w:tcPr/>
+          <w:p>
+            <w:pPr>
+              <w:pStyle w:val="Compact"/>
+            </w:pPr>
+            <w:r>
+              <w:t xml:space="preserve">Lõpp-punkt</w:t>
+            </w:r>
+          </w:p>
+        </w:tc>
+        <w:tc>
+          <w:tcPr/>
+          <w:p>
+            <w:pPr>
+              <w:pStyle w:val="Compact"/>
+            </w:pPr>
+            <w:r>
+              <w:t xml:space="preserve">Selgitus</w:t>
+            </w:r>
+          </w:p>
+        </w:tc>
+      </w:tr>
+      <w:tr>
+        <w:tc>
+          <w:tcPr/>
+          <w:p>
+            <w:pPr>
+              <w:pStyle w:val="Compact"/>
+            </w:pPr>
+            <w:r>
+              <w:t xml:space="preserve">POST</w:t>
+            </w:r>
+          </w:p>
+        </w:tc>
+        <w:tc>
+          <w:tcPr/>
+          <w:p>
+            <w:pPr>
+              <w:pStyle w:val="Compact"/>
+            </w:pPr>
+            <w:r>
+              <w:rPr>
+                <w:rStyle w:val="VerbatimChar"/>
+              </w:rPr>
+              <w:t xml:space="preserve">/v1/&lt;form-type&gt;/files/upload</w:t>
+            </w:r>
+          </w:p>
+        </w:tc>
+        <w:tc>
+          <w:tcPr/>
+          <w:p>
+            <w:pPr>
+              <w:pStyle w:val="Compact"/>
+            </w:pPr>
+            <w:r>
+              <w:t xml:space="preserve">Lisa uus manus</w:t>
+            </w:r>
+          </w:p>
+        </w:tc>
+      </w:tr>
+      <w:tr>
+        <w:tc>
+          <w:tcPr/>
+          <w:p>
+            <w:pPr>
+              <w:pStyle w:val="Compact"/>
+            </w:pPr>
+            <w:r>
+              <w:t xml:space="preserve">GET/POST</w:t>
+            </w:r>
+          </w:p>
+        </w:tc>
+        <w:tc>
+          <w:tcPr/>
+          <w:p>
+            <w:pPr>
+              <w:pStyle w:val="Compact"/>
+            </w:pPr>
+            <w:r>
+              <w:rPr>
+                <w:rStyle w:val="VerbatimChar"/>
+              </w:rPr>
+              <w:t xml:space="preserve">/v1/&lt;form-type&gt;/files/list</w:t>
+            </w:r>
+          </w:p>
+        </w:tc>
+        <w:tc>
+          <w:tcPr/>
+          <w:p>
+            <w:pPr>
+              <w:pStyle w:val="Compact"/>
+            </w:pPr>
+            <w:r>
+              <w:t xml:space="preserve">Loetle aktiivsed manused</w:t>
+            </w:r>
+          </w:p>
+        </w:tc>
+      </w:tr>
+      <w:tr>
+        <w:tc>
+          <w:tcPr/>
+          <w:p>
+            <w:pPr>
+              <w:pStyle w:val="Compact"/>
+            </w:pPr>
+            <w:r>
+              <w:t xml:space="preserve">GET/POST</w:t>
+            </w:r>
+          </w:p>
+        </w:tc>
+        <w:tc>
+          <w:tcPr/>
+          <w:p>
+            <w:pPr>
+              <w:pStyle w:val="Compact"/>
+            </w:pPr>
+            <w:r>
+              <w:rPr>
+                <w:rStyle w:val="VerbatimChar"/>
+              </w:rPr>
+              <w:t xml:space="preserve">/v1/&lt;form-type&gt;/files/download</w:t>
+            </w:r>
+          </w:p>
+        </w:tc>
+        <w:tc>
+          <w:tcPr/>
+          <w:p>
+            <w:pPr>
+              <w:pStyle w:val="Compact"/>
+            </w:pPr>
+            <w:r>
+              <w:t xml:space="preserve">Hangi presigned allalaadimise URL</w:t>
+            </w:r>
+          </w:p>
+        </w:tc>
+      </w:tr>
+      <w:tr>
+        <w:tc>
+          <w:tcPr/>
+          <w:p>
+            <w:pPr>
+              <w:pStyle w:val="Compact"/>
+            </w:pPr>
+            <w:r>
+              <w:t xml:space="preserve">POST/DELETE</w:t>
+            </w:r>
+          </w:p>
+        </w:tc>
+        <w:tc>
+          <w:tcPr/>
+          <w:p>
+            <w:pPr>
+              <w:pStyle w:val="Compact"/>
+            </w:pPr>
+            <w:r>
+              <w:rPr>
+                <w:rStyle w:val="VerbatimChar"/>
+              </w:rPr>
+              <w:t xml:space="preserve">/v1/&lt;form-type&gt;/files/delete</w:t>
+            </w:r>
+          </w:p>
+        </w:tc>
+        <w:tc>
+          <w:tcPr/>
+          <w:p>
+            <w:pPr>
+              <w:pStyle w:val="Compact"/>
+            </w:pPr>
+            <w:r>
+              <w:t xml:space="preserve">Märgista manus kustutatuks</w:t>
+            </w:r>
+          </w:p>
+        </w:tc>
+      </w:tr>
+    </w:tbl>
+    <w:p>
+      <w:pPr>
+        <w:pStyle w:val="BodyText"/>
+      </w:pPr>
+      <w:r>
+        <w:t xml:space="preserve">Täpsemad autentimise, parameetrite ja</w:t>
+      </w:r>
+      <w:r>
+        <w:t xml:space="preserve"> </w:t>
+      </w:r>
+      <w:r>
+        <w:rPr>
+          <w:rStyle w:val="VerbatimChar"/>
+        </w:rPr>
+        <w:t xml:space="preserve">curl</w:t>
+      </w:r>
+      <w:r>
+        <w:t xml:space="preserve"> </w:t>
+      </w:r>
+      <w:r>
+        <w:t xml:space="preserve">näidised on dokumendis</w:t>
+      </w:r>
+      <w:r>
+        <w:t xml:space="preserve"> </w:t>
+      </w:r>
+      <w:hyperlink r:id="rId20">
+        <w:r>
+          <w:rPr>
+            <w:rStyle w:val="VerbatimChar"/>
+          </w:rPr>
+          <w:t xml:space="preserve">07-api-info.md</w:t>
+        </w:r>
+      </w:hyperlink>
+      <w:r>
+        <w:t xml:space="preserve">.</w:t>
+      </w:r>
+    </w:p>
+    <w:bookmarkEnd w:id="95"/>
+    <w:bookmarkEnd w:id="96"/>
     <w:sectPr>
       <w:footnotePr>
         <w:numRestart w:val="eachSect"/>
@@ -14328,6 +16212,75 @@
     <w:abstractNumId w:val="991"/>
   </w:num>
   <w:num w:numId="1020">
+    <w:abstractNumId w:val="991"/>
+  </w:num>
+  <w:num w:numId="1021">
+    <w:abstractNumId w:val="991"/>
+  </w:num>
+  <w:num w:numId="1022">
+    <w:abstractNumId w:val="99411"/>
+    <w:lvlOverride w:ilvl="0">
+      <w:startOverride w:val="1"/>
+    </w:lvlOverride>
+    <w:lvlOverride w:ilvl="1">
+      <w:startOverride w:val="1"/>
+    </w:lvlOverride>
+    <w:lvlOverride w:ilvl="2">
+      <w:startOverride w:val="1"/>
+    </w:lvlOverride>
+    <w:lvlOverride w:ilvl="3">
+      <w:startOverride w:val="1"/>
+    </w:lvlOverride>
+    <w:lvlOverride w:ilvl="4">
+      <w:startOverride w:val="1"/>
+    </w:lvlOverride>
+    <w:lvlOverride w:ilvl="5">
+      <w:startOverride w:val="1"/>
+    </w:lvlOverride>
+    <w:lvlOverride w:ilvl="6">
+      <w:startOverride w:val="1"/>
+    </w:lvlOverride>
+    <w:lvlOverride w:ilvl="7">
+      <w:startOverride w:val="1"/>
+    </w:lvlOverride>
+    <w:lvlOverride w:ilvl="8">
+      <w:startOverride w:val="1"/>
+    </w:lvlOverride>
+  </w:num>
+  <w:num w:numId="1023">
+    <w:abstractNumId w:val="991"/>
+  </w:num>
+  <w:num w:numId="1024">
+    <w:abstractNumId w:val="99411"/>
+    <w:lvlOverride w:ilvl="0">
+      <w:startOverride w:val="1"/>
+    </w:lvlOverride>
+    <w:lvlOverride w:ilvl="1">
+      <w:startOverride w:val="1"/>
+    </w:lvlOverride>
+    <w:lvlOverride w:ilvl="2">
+      <w:startOverride w:val="1"/>
+    </w:lvlOverride>
+    <w:lvlOverride w:ilvl="3">
+      <w:startOverride w:val="1"/>
+    </w:lvlOverride>
+    <w:lvlOverride w:ilvl="4">
+      <w:startOverride w:val="1"/>
+    </w:lvlOverride>
+    <w:lvlOverride w:ilvl="5">
+      <w:startOverride w:val="1"/>
+    </w:lvlOverride>
+    <w:lvlOverride w:ilvl="6">
+      <w:startOverride w:val="1"/>
+    </w:lvlOverride>
+    <w:lvlOverride w:ilvl="7">
+      <w:startOverride w:val="1"/>
+    </w:lvlOverride>
+    <w:lvlOverride w:ilvl="8">
+      <w:startOverride w:val="1"/>
+    </w:lvlOverride>
+  </w:num>
+  <w:num w:numId="1025">
     <w:abstractNumId w:val="991"/>
   </w:num>
 </w:numbering>

</xml_diff>

<commit_message>
docs: proofread Estonian user and admin guides
Improve wording and correct typos throughout the attachment and
administration sections, including consistent Estonian terms for the
frontend, proxy, database, S3 versioning, and temporary download links.
Regenerate Word documents from the proofread Markdown.
</commit_message>
<xml_diff>
--- a/docs/admin-guide.docx
+++ b/docs/admin-guide.docx
@@ -1187,7 +1187,7 @@
         <w:t xml:space="preserve">/users/new</w:t>
       </w:r>
       <w:r>
-        <w:t xml:space="preserve">). Avaanex lehele</w:t>
+        <w:t xml:space="preserve">). Avaneb leht</w:t>
       </w:r>
       <w:r>
         <w:t xml:space="preserve"> </w:t>
@@ -1557,7 +1557,7 @@
         <w:pStyle w:val="FirstParagraph"/>
       </w:pPr>
       <w:r>
-        <w:t xml:space="preserve">Olemasoleva kasutaja muutmiseks klõpsa kasutajate nimekirjas soovitud kasutaja real. Avaanex detailvaates (</w:t>
+        <w:t xml:space="preserve">Olemasoleva kasutaja muutmiseks klõpsa kasutajate nimekirjas soovitud kasutaja real. Avanevas detailvaates (</w:t>
       </w:r>
       <w:r>
         <w:rPr>
@@ -13928,7 +13928,7 @@
         <w:pStyle w:val="FirstParagraph"/>
       </w:pPr>
       <w:r>
-        <w:t xml:space="preserve">Selles jaos kirjeldatakse, kuidas vormidega seotud failid tehniliselt töölevad, millised on piirangud ning kuidas neid ajalooliselt jälgida.</w:t>
+        <w:t xml:space="preserve">Selles jaos kirjeldatakse, kuidas vormidega seotud failid tehniliselt töötavad, millised on piirangud ning kuidas nende ajalugu jälgida.</w:t>
       </w:r>
     </w:p>
     <w:bookmarkEnd w:id="80"/>
@@ -14153,7 +14153,7 @@
         <w:pStyle w:val="BodyText"/>
       </w:pPr>
       <w:r>
-        <w:t xml:space="preserve">S3 proxy konfiguratsioonis (</w:t>
+        <w:t xml:space="preserve">S3-puhverserveri seadistuses (</w:t>
       </w:r>
       <w:r>
         <w:rPr>
@@ -14162,7 +14162,7 @@
         <w:t xml:space="preserve">docker-compose.yml</w:t>
       </w:r>
       <w:r>
-        <w:t xml:space="preserve">) on vaikimisi lubatud MIME-tüübid laiemad:</w:t>
+        <w:t xml:space="preserve">) on vaikimisi lubatud MIME-tüüpide loend laiem:</w:t>
       </w:r>
     </w:p>
     <w:p>
@@ -14515,14 +14515,14 @@
       <w:r>
         <w:drawing>
           <wp:inline>
-            <wp:extent cx="5334000" cy="333375"/>
+            <wp:extent cx="5334000" cy="326571"/>
             <wp:effectExtent b="0" l="0" r="0" t="0"/>
             <wp:docPr descr="" title="" id="83" name="Picture"/>
             <a:graphic>
               <a:graphicData uri="http://schemas.openxmlformats.org/drawingml/2006/picture">
                 <pic:pic>
                   <pic:nvPicPr>
-                    <pic:cNvPr descr="_mermaid_images/mermaid_1_6badd94f4b.png" id="84" name="Picture"/>
+                    <pic:cNvPr descr="_mermaid_images/mermaid_1_9f1eed8757.png" id="84" name="Picture"/>
                     <pic:cNvPicPr>
                       <a:picLocks noChangeArrowheads="1" noChangeAspect="1"/>
                     </pic:cNvPicPr>
@@ -14536,7 +14536,7 @@
                   <pic:spPr bwMode="auto">
                     <a:xfrm>
                       <a:off x="0" y="0"/>
-                      <a:ext cx="5334000" cy="333375"/>
+                      <a:ext cx="5334000" cy="326571"/>
                     </a:xfrm>
                     <a:prstGeom prst="rect">
                       <a:avLst/>
@@ -15028,17 +15028,17 @@
         <w:t xml:space="preserve"> </w:t>
       </w:r>
       <w:r>
-        <w:t xml:space="preserve">üleslaadimiste ajalugu, kuid mitte alati iga versiooni sisu (kui S3 versioning ei ole lubatud).</w:t>
+        <w:t xml:space="preserve">üleslaadimiste ajalugu, kuid mitte alati iga versiooni sisu (kui S3 versioonihaldus ei ole lubatud).</w:t>
       </w:r>
     </w:p>
     <w:bookmarkEnd w:id="90"/>
-    <w:bookmarkStart w:id="91" w:name="s3-versioning"/>
+    <w:bookmarkStart w:id="91" w:name="s3-versioonihaldus"/>
     <w:p>
       <w:pPr>
         <w:pStyle w:val="Heading3"/>
       </w:pPr>
       <w:r>
-        <w:t xml:space="preserve">S3 versioning</w:t>
+        <w:t xml:space="preserve">S3 versioonihaldus</w:t>
       </w:r>
     </w:p>
     <w:p>
@@ -15046,7 +15046,7 @@
         <w:pStyle w:val="FirstParagraph"/>
       </w:pPr>
       <w:r>
-        <w:t xml:space="preserve">Kui S3 bucketis on lubatud</w:t>
+        <w:t xml:space="preserve">Kui S3-hoidlas on lubatud</w:t>
       </w:r>
       <w:r>
         <w:t xml:space="preserve"> </w:t>
@@ -15056,7 +15056,7 @@
           <w:b/>
           <w:bCs/>
         </w:rPr>
-        <w:t xml:space="preserve">S3 versioning</w:t>
+        <w:t xml:space="preserve">S3 versioonihaldus</w:t>
       </w:r>
       <w:r>
         <w:t xml:space="preserve">, salvestatakse sama võtme all ka varasemad versioonid. See võimaldab administraatoril taastada või vaadata vanemaid faile otse S3 konsooli või AWS CLI kaudu.</w:t>
@@ -15716,7 +15716,7 @@
               <w:pStyle w:val="Compact"/>
             </w:pPr>
             <w:r>
-              <w:t xml:space="preserve">Hangi presigned allalaadimise URL</w:t>
+              <w:t xml:space="preserve">Hangi eelsigneeritud allalaadimislink</w:t>
             </w:r>
           </w:p>
         </w:tc>

</xml_diff>